<commit_message>
Fix on summary and updated resume. Also added random skills on load.
</commit_message>
<xml_diff>
--- a/CorporatePortfolio/wwwroot/DavidTurner_Resume.docx
+++ b/CorporatePortfolio/wwwroot/DavidTurner_Resume.docx
@@ -105,14 +105,66 @@
       </w:pPr>
       <w:bookmarkStart w:id="2" w:name="Competencies"/>
       <w:r>
-        <w:t>Core Tech: C# .NET Core</w:t>
-      </w:r>
-      <w:r>
-        <w:t xml:space="preserve">, SQL, </w:t>
-      </w:r>
-      <w:r>
-        <w:t>TypeScript, ASP.NET Core, MVC, Entity Framework, Angular, SignalR</w:t>
-      </w:r>
+        <w:rPr>
+          <w:b/>
+          <w:bCs/>
+        </w:rPr>
+        <w:t>Core Tech</w:t>
+      </w:r>
+      <w:r>
+        <w:t>: C# .NET Core</w:t>
+      </w:r>
+      <w:r>
+        <w:t>,</w:t>
+      </w:r>
+      <w:r>
+        <w:t xml:space="preserve"> </w:t>
+      </w:r>
+      <w:r>
+        <w:t>C++ (Arduino)</w:t>
+      </w:r>
+      <w:r>
+        <w:t>,</w:t>
+      </w:r>
+      <w:r>
+        <w:t xml:space="preserve"> </w:t>
+      </w:r>
+      <w:r>
+        <w:t xml:space="preserve">Microsoft </w:t>
+      </w:r>
+      <w:r>
+        <w:t xml:space="preserve">SQL, </w:t>
+      </w:r>
+      <w:r>
+        <w:t xml:space="preserve">TypeScript, ASP.NET Core, MVC, Entity Framework, Angular, </w:t>
+      </w:r>
+      <w:proofErr w:type="spellStart"/>
+      <w:r>
+        <w:t>SignalR</w:t>
+      </w:r>
+      <w:proofErr w:type="spellEnd"/>
+      <w:r>
+        <w:t xml:space="preserve">, </w:t>
+      </w:r>
+      <w:r>
+        <w:t>.NET MAUI</w:t>
+      </w:r>
+      <w:r>
+        <w:t>, .NET 10, Android SDK</w:t>
+      </w:r>
+    </w:p>
+    <w:p>
+      <w:pPr>
+        <w:pStyle w:val="ListBullet"/>
+        <w:numPr>
+          <w:ilvl w:val="0"/>
+          <w:numId w:val="0"/>
+        </w:numPr>
+        <w:tabs>
+          <w:tab w:val="num" w:pos="7088"/>
+        </w:tabs>
+        <w:ind w:left="426"/>
+      </w:pPr>
     </w:p>
     <w:p>
       <w:pPr>
@@ -124,14 +176,37 @@
         <w:ind w:left="426"/>
       </w:pPr>
       <w:r>
+        <w:rPr>
+          <w:b/>
+          <w:bCs/>
+        </w:rPr>
         <w:t>Azure &amp; DevOps</w:t>
       </w:r>
       <w:r>
         <w:t xml:space="preserve">: </w:t>
       </w:r>
       <w:r>
-        <w:t>App Services, Azure SQL, Azure DevOps (YAML Pipelines, CI/CD), AD, Git, NuGet</w:t>
-      </w:r>
+        <w:t xml:space="preserve">App Services, Azure SQL, Azure DevOps (YAML Pipelines, CI/CD), AD, Git, </w:t>
+      </w:r>
+      <w:r>
+        <w:t xml:space="preserve">GitHub, </w:t>
+      </w:r>
+      <w:r>
+        <w:t>NuGet</w:t>
+      </w:r>
+    </w:p>
+    <w:p>
+      <w:pPr>
+        <w:pStyle w:val="ListBullet"/>
+        <w:numPr>
+          <w:ilvl w:val="0"/>
+          <w:numId w:val="0"/>
+        </w:numPr>
+        <w:tabs>
+          <w:tab w:val="num" w:pos="7088"/>
+        </w:tabs>
+        <w:ind w:left="426"/>
+      </w:pPr>
     </w:p>
     <w:p>
       <w:pPr>
@@ -143,11 +218,28 @@
         <w:ind w:left="426"/>
       </w:pPr>
       <w:r>
-        <w:t xml:space="preserve">Enterprise &amp; Tools: </w:t>
-      </w:r>
-      <w:r>
-        <w:t>SmartSimple CRM, CRM Dynamics, Active Directory, ADFS, SCCM, Visual Studio, Selenium, xUnit/nUnit, MS Test</w:t>
-      </w:r>
+        <w:rPr>
+          <w:b/>
+          <w:bCs/>
+        </w:rPr>
+        <w:t>Networking &amp; Protocols</w:t>
+      </w:r>
+      <w:r>
+        <w:t>: Bluetooth Low Energy (BLE), Wi-Fi Access Point (AP), IPV4 Subnet Masking, NTP, REST APIs</w:t>
+      </w:r>
+    </w:p>
+    <w:p>
+      <w:pPr>
+        <w:pStyle w:val="ListBullet"/>
+        <w:numPr>
+          <w:ilvl w:val="0"/>
+          <w:numId w:val="0"/>
+        </w:numPr>
+        <w:tabs>
+          <w:tab w:val="num" w:pos="7088"/>
+        </w:tabs>
+        <w:ind w:left="426"/>
+      </w:pPr>
     </w:p>
     <w:p>
       <w:pPr>
@@ -159,20 +251,27 @@
         <w:ind w:left="426"/>
       </w:pPr>
       <w:r>
-        <w:t xml:space="preserve">Practices &amp; UI: </w:t>
-      </w:r>
-      <w:r>
-        <w:t>Agile/Scrum, TDD, SDLC, Code Reviews, Design Patterns,</w:t>
-      </w:r>
-      <w:r>
-        <w:t xml:space="preserve"> Automation,</w:t>
-      </w:r>
-      <w:r>
-        <w:t xml:space="preserve"> Kendo UI, jQuery, Responsive UI</w:t>
-      </w:r>
-      <w:r>
-        <w:t>, Razor, Blazor, Angular 2.0, AngularJS, JavaScript, CSS</w:t>
-      </w:r>
+        <w:rPr>
+          <w:b/>
+          <w:bCs/>
+        </w:rPr>
+        <w:t>Security &amp; Cryptography</w:t>
+      </w:r>
+      <w:r>
+        <w:t>: AES-128-CBC, Fletcher-16 Hashing, Symmetric Key Ciphers, Android Runtime Permissions</w:t>
+      </w:r>
+    </w:p>
+    <w:p>
+      <w:pPr>
+        <w:pStyle w:val="ListBullet"/>
+        <w:numPr>
+          <w:ilvl w:val="0"/>
+          <w:numId w:val="0"/>
+        </w:numPr>
+        <w:tabs>
+          <w:tab w:val="num" w:pos="7088"/>
+        </w:tabs>
+      </w:pPr>
     </w:p>
     <w:p>
       <w:pPr>
@@ -184,8 +283,189 @@
         <w:ind w:left="426"/>
       </w:pPr>
       <w:r>
-        <w:t>Operating Systems: Windows (All Versions), Linux (Ubuntu, Fedora, Redhat, Kali)</w:t>
-      </w:r>
+        <w:rPr>
+          <w:b/>
+          <w:bCs/>
+        </w:rPr>
+        <w:t>Embedded &amp; Hardware Systems Controls</w:t>
+      </w:r>
+      <w:r>
+        <w:t xml:space="preserve">: Arduino R4 </w:t>
+      </w:r>
+      <w:proofErr w:type="spellStart"/>
+      <w:r>
+        <w:t>Wifi</w:t>
+      </w:r>
+      <w:proofErr w:type="spellEnd"/>
+      <w:r>
+        <w:t xml:space="preserve">, Analog-to-Digital Converters (CDC), EEPROM Persistent Storage, Real-Time Clocks (RTC), Relay Circuit Isolation, Power Inverter setup </w:t>
+      </w:r>
+    </w:p>
+    <w:p>
+      <w:pPr>
+        <w:pStyle w:val="ListBullet"/>
+        <w:numPr>
+          <w:ilvl w:val="0"/>
+          <w:numId w:val="0"/>
+        </w:numPr>
+        <w:tabs>
+          <w:tab w:val="num" w:pos="7088"/>
+        </w:tabs>
+      </w:pPr>
+      <w:r>
+        <w:tab/>
+      </w:r>
+    </w:p>
+    <w:p>
+      <w:pPr>
+        <w:pStyle w:val="ListBullet"/>
+        <w:tabs>
+          <w:tab w:val="clear" w:pos="7448"/>
+          <w:tab w:val="num" w:pos="7088"/>
+        </w:tabs>
+        <w:ind w:left="426"/>
+      </w:pPr>
+      <w:r>
+        <w:rPr>
+          <w:b/>
+          <w:bCs/>
+        </w:rPr>
+        <w:t>Enterprise &amp; Tools</w:t>
+      </w:r>
+      <w:r>
+        <w:t xml:space="preserve">: </w:t>
+      </w:r>
+      <w:r>
+        <w:t>SmartSimple CRM, CRM Dynamics, Active Directory, ADFS, SCCM, Visual Studio</w:t>
+      </w:r>
+      <w:r>
+        <w:t xml:space="preserve"> 2026</w:t>
+      </w:r>
+      <w:r>
+        <w:t xml:space="preserve">, Selenium, </w:t>
+      </w:r>
+      <w:proofErr w:type="spellStart"/>
+      <w:r>
+        <w:t>xUnit</w:t>
+      </w:r>
+      <w:proofErr w:type="spellEnd"/>
+      <w:r>
+        <w:t>/</w:t>
+      </w:r>
+      <w:proofErr w:type="spellStart"/>
+      <w:r>
+        <w:t>nUnit</w:t>
+      </w:r>
+      <w:proofErr w:type="spellEnd"/>
+      <w:r>
+        <w:t>, MS Test</w:t>
+      </w:r>
+      <w:r>
+        <w:t>, Cloudflare Workers</w:t>
+      </w:r>
+      <w:r>
+        <w:t>, Arduino IDE</w:t>
+      </w:r>
+    </w:p>
+    <w:p>
+      <w:pPr>
+        <w:pStyle w:val="ListBullet"/>
+        <w:numPr>
+          <w:ilvl w:val="0"/>
+          <w:numId w:val="0"/>
+        </w:numPr>
+        <w:tabs>
+          <w:tab w:val="num" w:pos="7088"/>
+        </w:tabs>
+        <w:ind w:left="426"/>
+      </w:pPr>
+      <w:r>
+        <w:t xml:space="preserve"> </w:t>
+      </w:r>
+    </w:p>
+    <w:p>
+      <w:pPr>
+        <w:pStyle w:val="ListBullet"/>
+        <w:tabs>
+          <w:tab w:val="clear" w:pos="7448"/>
+          <w:tab w:val="num" w:pos="7088"/>
+        </w:tabs>
+        <w:ind w:left="426"/>
+      </w:pPr>
+      <w:r>
+        <w:rPr>
+          <w:b/>
+          <w:bCs/>
+        </w:rPr>
+        <w:t>Practices &amp; UI</w:t>
+      </w:r>
+      <w:r>
+        <w:t xml:space="preserve">: </w:t>
+      </w:r>
+      <w:r>
+        <w:t>Agile/Scrum, TDD, SDLC, Code Reviews, Design Patterns,</w:t>
+      </w:r>
+      <w:r>
+        <w:t xml:space="preserve"> Automation,</w:t>
+      </w:r>
+      <w:r>
+        <w:t xml:space="preserve"> Kendo UI, jQuery, Responsive UI</w:t>
+      </w:r>
+      <w:r>
+        <w:t>, Razor, Blazor, Angular 2.0, AngularJS, JavaScript, CSS</w:t>
+      </w:r>
+    </w:p>
+    <w:p>
+      <w:pPr>
+        <w:pStyle w:val="ListBullet"/>
+        <w:numPr>
+          <w:ilvl w:val="0"/>
+          <w:numId w:val="0"/>
+        </w:numPr>
+        <w:tabs>
+          <w:tab w:val="num" w:pos="7088"/>
+        </w:tabs>
+      </w:pPr>
+    </w:p>
+    <w:p>
+      <w:pPr>
+        <w:pStyle w:val="ListBullet"/>
+        <w:tabs>
+          <w:tab w:val="clear" w:pos="7448"/>
+          <w:tab w:val="num" w:pos="7088"/>
+        </w:tabs>
+        <w:ind w:left="426"/>
+      </w:pPr>
+      <w:r>
+        <w:rPr>
+          <w:b/>
+          <w:bCs/>
+        </w:rPr>
+        <w:t>Operating Systems</w:t>
+      </w:r>
+      <w:r>
+        <w:t xml:space="preserve">: Windows (All Versions), Linux (Ubuntu, Fedora, </w:t>
+      </w:r>
+      <w:proofErr w:type="spellStart"/>
+      <w:r>
+        <w:t>Redhat</w:t>
+      </w:r>
+      <w:proofErr w:type="spellEnd"/>
+      <w:r>
+        <w:t>, Kali)</w:t>
+      </w:r>
+    </w:p>
+    <w:p>
+      <w:pPr>
+        <w:pStyle w:val="ListBullet"/>
+        <w:numPr>
+          <w:ilvl w:val="0"/>
+          <w:numId w:val="0"/>
+        </w:numPr>
+        <w:tabs>
+          <w:tab w:val="num" w:pos="7088"/>
+        </w:tabs>
+      </w:pPr>
     </w:p>
     <w:p>
       <w:pPr>
@@ -196,28 +476,130 @@
         </w:tabs>
         <w:ind w:left="426"/>
         <w:rPr>
-          <w:lang w:val="es-ES"/>
+          <w:lang w:val="en-CA"/>
         </w:rPr>
       </w:pPr>
       <w:r>
         <w:rPr>
-          <w:lang w:val="es-ES"/>
+          <w:b/>
+          <w:bCs/>
+          <w:lang w:val="en-CA"/>
         </w:rPr>
-        <w:t>AI Components: Ollama, Groq, Lla</w:t>
+        <w:t>AI Components</w:t>
       </w:r>
       <w:r>
         <w:rPr>
-          <w:lang w:val="es-ES"/>
+          <w:lang w:val="en-CA"/>
         </w:rPr>
-        <w:t>ma3.2 LLM, Model Training</w:t>
-      </w:r>
+        <w:t xml:space="preserve">: </w:t>
+      </w:r>
+      <w:proofErr w:type="spellStart"/>
       <w:r>
         <w:rPr>
-          <w:lang w:val="es-ES"/>
+          <w:lang w:val="en-CA"/>
+        </w:rPr>
+        <w:t>Ollama</w:t>
+      </w:r>
+      <w:proofErr w:type="spellEnd"/>
+      <w:r>
+        <w:rPr>
+          <w:lang w:val="en-CA"/>
+        </w:rPr>
+        <w:t xml:space="preserve">, </w:t>
+      </w:r>
+      <w:proofErr w:type="spellStart"/>
+      <w:r>
+        <w:rPr>
+          <w:lang w:val="en-CA"/>
+        </w:rPr>
+        <w:t>Groq</w:t>
+      </w:r>
+      <w:proofErr w:type="spellEnd"/>
+      <w:r>
+        <w:rPr>
+          <w:lang w:val="en-CA"/>
+        </w:rPr>
+        <w:t>, Llama3.2 LLM,</w:t>
+      </w:r>
+      <w:r>
+        <w:rPr>
+          <w:lang w:val="en-CA"/>
+        </w:rPr>
+        <w:t xml:space="preserve"> </w:t>
+      </w:r>
+      <w:r>
+        <w:t>OpenAI GPT-OSS 20B</w:t>
+      </w:r>
+      <w:r>
+        <w:t xml:space="preserve"> LLM,</w:t>
+      </w:r>
+      <w:r>
+        <w:rPr>
+          <w:lang w:val="en-CA"/>
+        </w:rPr>
+        <w:t xml:space="preserve"> Model Training</w:t>
+      </w:r>
+      <w:r>
+        <w:rPr>
+          <w:lang w:val="en-CA"/>
         </w:rPr>
         <w:t>, Generative AI (Azure AI Vision)</w:t>
       </w:r>
       <w:bookmarkEnd w:id="2"/>
+      <w:r>
+        <w:rPr>
+          <w:lang w:val="en-CA"/>
+        </w:rPr>
+        <w:t>, F5 Voice Services</w:t>
+      </w:r>
+    </w:p>
+    <w:p>
+      <w:pPr>
+        <w:pStyle w:val="ListBullet"/>
+        <w:numPr>
+          <w:ilvl w:val="0"/>
+          <w:numId w:val="0"/>
+        </w:numPr>
+        <w:tabs>
+          <w:tab w:val="num" w:pos="7088"/>
+        </w:tabs>
+        <w:ind w:left="7448" w:hanging="360"/>
+        <w:rPr>
+          <w:lang w:val="en-CA"/>
+        </w:rPr>
+      </w:pPr>
+    </w:p>
+    <w:p>
+      <w:pPr>
+        <w:pStyle w:val="ListBullet"/>
+        <w:numPr>
+          <w:ilvl w:val="0"/>
+          <w:numId w:val="0"/>
+        </w:numPr>
+        <w:tabs>
+          <w:tab w:val="num" w:pos="7088"/>
+        </w:tabs>
+        <w:ind w:left="7448" w:hanging="360"/>
+        <w:rPr>
+          <w:lang w:val="en-CA"/>
+        </w:rPr>
+      </w:pPr>
+    </w:p>
+    <w:p>
+      <w:pPr>
+        <w:pStyle w:val="ListBullet"/>
+        <w:numPr>
+          <w:ilvl w:val="0"/>
+          <w:numId w:val="0"/>
+        </w:numPr>
+        <w:tabs>
+          <w:tab w:val="num" w:pos="7088"/>
+        </w:tabs>
+        <w:ind w:left="7448" w:hanging="360"/>
+        <w:rPr>
+          <w:lang w:val="en-CA"/>
+        </w:rPr>
+      </w:pPr>
     </w:p>
     <w:p>
       <w:pPr>
@@ -342,7 +724,6 @@
         <w:ind w:left="426"/>
       </w:pPr>
       <w:r>
-        <w:lastRenderedPageBreak/>
         <w:t>Managed Azure infrastructure: SQL, AD, networking, VMs, app registrations, and security groups.</w:t>
       </w:r>
     </w:p>
@@ -553,6 +934,26 @@
     </w:p>
     <w:p>
       <w:pPr>
+        <w:pStyle w:val="ListBullet"/>
+        <w:numPr>
+          <w:ilvl w:val="0"/>
+          <w:numId w:val="0"/>
+        </w:numPr>
+        <w:ind w:left="360"/>
+      </w:pPr>
+    </w:p>
+    <w:p>
+      <w:pPr>
+        <w:pStyle w:val="ListBullet"/>
+        <w:numPr>
+          <w:ilvl w:val="0"/>
+          <w:numId w:val="0"/>
+        </w:numPr>
+        <w:ind w:left="360"/>
+      </w:pPr>
+    </w:p>
+    <w:p>
+      <w:pPr>
         <w:pStyle w:val="Heading3"/>
         <w:ind w:left="227" w:hanging="227"/>
         <w:rPr>
@@ -561,119 +962,6 @@
         </w:rPr>
       </w:pPr>
       <w:bookmarkStart w:id="7" w:name="Experience_3"/>
-      <w:r>
-        <w:rPr>
-          <w:i/>
-          <w:iCs/>
-          <w:sz w:val="24"/>
-          <w:szCs w:val="24"/>
-        </w:rPr>
-        <w:t>SCI MarketView – Markham, ON</w:t>
-      </w:r>
-    </w:p>
-    <w:p>
-      <w:pPr>
-        <w:pStyle w:val="Heading3"/>
-        <w:spacing w:before="0"/>
-        <w:ind w:left="227" w:hanging="227"/>
-      </w:pPr>
-      <w:r>
-        <w:t>Senior DevOps &amp; Automation Developer</w:t>
-      </w:r>
-    </w:p>
-    <w:p>
-      <w:pPr>
-        <w:jc w:val="right"/>
-      </w:pPr>
-      <w:r>
-        <w:rPr>
-          <w:sz w:val="20"/>
-        </w:rPr>
-        <w:t xml:space="preserve">Jan 2016 – </w:t>
-      </w:r>
-      <w:r>
-        <w:rPr>
-          <w:sz w:val="20"/>
-        </w:rPr>
-        <w:t>Jan 2017</w:t>
-      </w:r>
-      <w:bookmarkEnd w:id="7"/>
-    </w:p>
-    <w:p>
-      <w:pPr>
-        <w:pStyle w:val="ListBullet"/>
-        <w:tabs>
-          <w:tab w:val="clear" w:pos="7448"/>
-          <w:tab w:val="num" w:pos="7088"/>
-        </w:tabs>
-        <w:ind w:left="426"/>
-      </w:pPr>
-      <w:bookmarkStart w:id="8" w:name="Experience_3_Details"/>
-      <w:r>
-        <w:t>Created incremental build and packaging systems in TFS 2013, significantly reducing build time and resource use.</w:t>
-      </w:r>
-    </w:p>
-    <w:p>
-      <w:pPr>
-        <w:pStyle w:val="ListBullet"/>
-        <w:tabs>
-          <w:tab w:val="clear" w:pos="7448"/>
-        </w:tabs>
-        <w:ind w:left="426"/>
-      </w:pPr>
-      <w:r>
-        <w:t>Developed a Slack-integrated bot using C# to control builds, deployments, server restarts, and report delivery statuses.</w:t>
-      </w:r>
-    </w:p>
-    <w:p>
-      <w:pPr>
-        <w:pStyle w:val="ListBullet"/>
-        <w:tabs>
-          <w:tab w:val="clear" w:pos="7448"/>
-        </w:tabs>
-        <w:ind w:left="426"/>
-      </w:pPr>
-      <w:r>
-        <w:t>Created secure credential storage systems with real-time access control for deployment operations.</w:t>
-      </w:r>
-    </w:p>
-    <w:p>
-      <w:pPr>
-        <w:pStyle w:val="ListBullet"/>
-        <w:tabs>
-          <w:tab w:val="clear" w:pos="7448"/>
-        </w:tabs>
-        <w:ind w:left="426"/>
-      </w:pPr>
-      <w:r>
-        <w:t>Built parallelized Selenium test infrastructure and custom Angular-aware test handling logic.</w:t>
-      </w:r>
-    </w:p>
-    <w:p>
-      <w:pPr>
-        <w:pStyle w:val="ListBullet"/>
-        <w:tabs>
-          <w:tab w:val="clear" w:pos="7448"/>
-          <w:tab w:val="num" w:pos="7088"/>
-        </w:tabs>
-        <w:ind w:left="426"/>
-      </w:pPr>
-      <w:r>
-        <w:t>Authored numerous PowerShell scripts for deployment, monitoring, user impersonation, and automation.</w:t>
-      </w:r>
-      <w:bookmarkEnd w:id="8"/>
-    </w:p>
-    <w:p>
-      <w:r>
-        <w:br w:type="page"/>
-      </w:r>
-    </w:p>
-    <w:p>
-      <w:pPr>
-        <w:pStyle w:val="Heading3"/>
-        <w:spacing w:before="480"/>
-      </w:pPr>
-      <w:bookmarkStart w:id="9" w:name="Experience_4"/>
       <w:r>
         <w:rPr>
           <w:i/>
@@ -682,7 +970,7 @@
           <w:szCs w:val="24"/>
         </w:rPr>
         <w:lastRenderedPageBreak/>
-        <w:t>Bank of Montreal – Toronto, ON</w:t>
+        <w:t>SCI MarketView – Markham, ON</w:t>
       </w:r>
     </w:p>
     <w:p>
@@ -692,7 +980,7 @@
         <w:ind w:left="227" w:hanging="227"/>
       </w:pPr>
       <w:r>
-        <w:t>Integration Analyst / Developer</w:t>
+        <w:t>Senior DevOps &amp; Automation Developer</w:t>
       </w:r>
     </w:p>
     <w:p>
@@ -703,9 +991,29 @@
         <w:rPr>
           <w:sz w:val="20"/>
         </w:rPr>
-        <w:t>Sep 2011 – Mar 2015</w:t>
-      </w:r>
-      <w:bookmarkEnd w:id="9"/>
+        <w:t xml:space="preserve">Jan 2016 – </w:t>
+      </w:r>
+      <w:r>
+        <w:rPr>
+          <w:sz w:val="20"/>
+        </w:rPr>
+        <w:t>Jan 2017</w:t>
+      </w:r>
+      <w:bookmarkEnd w:id="7"/>
+    </w:p>
+    <w:p>
+      <w:pPr>
+        <w:pStyle w:val="ListBullet"/>
+        <w:tabs>
+          <w:tab w:val="clear" w:pos="7448"/>
+          <w:tab w:val="num" w:pos="7088"/>
+        </w:tabs>
+        <w:ind w:left="426"/>
+      </w:pPr>
+      <w:bookmarkStart w:id="8" w:name="Experience_3_Details"/>
+      <w:r>
+        <w:t>Created incremental build and packaging systems in TFS 2013, significantly reducing build time and resource use.</w:t>
+      </w:r>
     </w:p>
     <w:p>
       <w:pPr>
@@ -715,9 +1023,8 @@
         </w:tabs>
         <w:ind w:left="426"/>
       </w:pPr>
-      <w:bookmarkStart w:id="10" w:name="Experience_4_Details"/>
-      <w:r>
-        <w:t>Built tools for SCCM delivery tracking, GPO management, and software deployment automation.</w:t>
+      <w:r>
+        <w:t>Developed a Slack-integrated bot using C# to control builds, deployments, server restarts, and report delivery statuses.</w:t>
       </w:r>
     </w:p>
     <w:p>
@@ -729,7 +1036,7 @@
         <w:ind w:left="426"/>
       </w:pPr>
       <w:r>
-        <w:t>Developed Silverlight, C#, and SQL-based applications for enterprise data management and operations.</w:t>
+        <w:t>Created secure credential storage systems with real-time access control for deployment operations.</w:t>
       </w:r>
     </w:p>
     <w:p>
@@ -741,26 +1048,29 @@
         <w:ind w:left="426"/>
       </w:pPr>
       <w:r>
-        <w:t>Delivered remote workstation management utilities used bank-wide for IT support and deployment control.</w:t>
-      </w:r>
-      <w:bookmarkEnd w:id="10"/>
+        <w:t>Built parallelized Selenium test infrastructure and custom Angular-aware test handling logic.</w:t>
+      </w:r>
     </w:p>
     <w:p>
       <w:pPr>
         <w:pStyle w:val="ListBullet"/>
-        <w:numPr>
-          <w:ilvl w:val="0"/>
-          <w:numId w:val="0"/>
-        </w:numPr>
-        <w:ind w:left="360"/>
-      </w:pPr>
+        <w:tabs>
+          <w:tab w:val="clear" w:pos="7448"/>
+          <w:tab w:val="num" w:pos="7088"/>
+        </w:tabs>
+        <w:ind w:left="426"/>
+      </w:pPr>
+      <w:r>
+        <w:t>Authored numerous PowerShell scripts for deployment, monitoring, user impersonation, and automation.</w:t>
+      </w:r>
+      <w:bookmarkEnd w:id="8"/>
     </w:p>
     <w:p>
       <w:pPr>
         <w:pStyle w:val="Heading3"/>
         <w:spacing w:before="480"/>
       </w:pPr>
-      <w:bookmarkStart w:id="11" w:name="Experience_5"/>
+      <w:bookmarkStart w:id="9" w:name="Experience_4"/>
       <w:r>
         <w:rPr>
           <w:i/>
@@ -778,7 +1088,7 @@
         <w:ind w:left="227" w:hanging="227"/>
       </w:pPr>
       <w:r>
-        <w:t>Technical Support Analyst / Developer</w:t>
+        <w:t>Integration Analyst / Developer</w:t>
       </w:r>
     </w:p>
     <w:p>
@@ -789,9 +1099,9 @@
         <w:rPr>
           <w:sz w:val="20"/>
         </w:rPr>
-        <w:t>Mar 2009 – Sep 2011</w:t>
-      </w:r>
-      <w:bookmarkEnd w:id="11"/>
+        <w:t>Sep 2011 – Mar 2015</w:t>
+      </w:r>
+      <w:bookmarkEnd w:id="9"/>
     </w:p>
     <w:p>
       <w:pPr>
@@ -801,9 +1111,9 @@
         </w:tabs>
         <w:ind w:left="426"/>
       </w:pPr>
-      <w:bookmarkStart w:id="12" w:name="Experience_5_Details"/>
-      <w:r>
-        <w:t>Designed a widely adopted all-in-one IT support tool integrating password resets, remote access, AD tools, and internal KBs.</w:t>
+      <w:bookmarkStart w:id="10" w:name="Experience_4_Details"/>
+      <w:r>
+        <w:t>Built tools for SCCM delivery tracking, GPO management, and software deployment automation.</w:t>
       </w:r>
     </w:p>
     <w:p>
@@ -815,11 +1125,107 @@
         <w:ind w:left="426"/>
       </w:pPr>
       <w:r>
+        <w:t>Developed Silverlight, C#, and SQL-based applications for enterprise data management and operations.</w:t>
+      </w:r>
+    </w:p>
+    <w:p>
+      <w:pPr>
+        <w:pStyle w:val="ListBullet"/>
+        <w:tabs>
+          <w:tab w:val="clear" w:pos="7448"/>
+        </w:tabs>
+        <w:ind w:left="426"/>
+      </w:pPr>
+      <w:r>
+        <w:t>Delivered remote workstation management utilities used bank-wide for IT support and deployment control.</w:t>
+      </w:r>
+      <w:bookmarkEnd w:id="10"/>
+    </w:p>
+    <w:p>
+      <w:pPr>
+        <w:pStyle w:val="ListBullet"/>
+        <w:numPr>
+          <w:ilvl w:val="0"/>
+          <w:numId w:val="0"/>
+        </w:numPr>
+        <w:ind w:left="360"/>
+      </w:pPr>
+    </w:p>
+    <w:p>
+      <w:pPr>
+        <w:pStyle w:val="Heading3"/>
+        <w:spacing w:before="480"/>
+      </w:pPr>
+      <w:bookmarkStart w:id="11" w:name="Experience_5"/>
+      <w:r>
+        <w:rPr>
+          <w:i/>
+          <w:iCs/>
+          <w:sz w:val="24"/>
+          <w:szCs w:val="24"/>
+        </w:rPr>
+        <w:t>Bank of Montreal – Toronto, ON</w:t>
+      </w:r>
+    </w:p>
+    <w:p>
+      <w:pPr>
+        <w:pStyle w:val="Heading3"/>
+        <w:spacing w:before="0"/>
+        <w:ind w:left="227" w:hanging="227"/>
+      </w:pPr>
+      <w:r>
+        <w:t>Technical Support Analyst / Developer</w:t>
+      </w:r>
+    </w:p>
+    <w:p>
+      <w:pPr>
+        <w:jc w:val="right"/>
+      </w:pPr>
+      <w:r>
+        <w:rPr>
+          <w:sz w:val="20"/>
+        </w:rPr>
+        <w:t>Mar 2009 – Sep 2011</w:t>
+      </w:r>
+      <w:bookmarkEnd w:id="11"/>
+    </w:p>
+    <w:p>
+      <w:pPr>
+        <w:pStyle w:val="ListBullet"/>
+        <w:tabs>
+          <w:tab w:val="clear" w:pos="7448"/>
+        </w:tabs>
+        <w:ind w:left="426"/>
+      </w:pPr>
+      <w:bookmarkStart w:id="12" w:name="Experience_5_Details"/>
+      <w:r>
+        <w:t>Designed a widely adopted all-in-one IT support tool integrating password resets, remote access, AD tools, and internal KBs.</w:t>
+      </w:r>
+    </w:p>
+    <w:p>
+      <w:pPr>
+        <w:pStyle w:val="ListBullet"/>
+        <w:tabs>
+          <w:tab w:val="clear" w:pos="7448"/>
+        </w:tabs>
+        <w:ind w:left="426"/>
+      </w:pPr>
+      <w:r>
         <w:t xml:space="preserve">Reverse engineered </w:t>
       </w:r>
-      <w:r>
-        <w:t>PsTools by Sysinternals</w:t>
-      </w:r>
+      <w:proofErr w:type="spellStart"/>
+      <w:r>
+        <w:t>PsTools</w:t>
+      </w:r>
+      <w:proofErr w:type="spellEnd"/>
+      <w:r>
+        <w:t xml:space="preserve"> by </w:t>
+      </w:r>
+      <w:proofErr w:type="spellStart"/>
+      <w:r>
+        <w:t>Sysinternals</w:t>
+      </w:r>
+      <w:proofErr w:type="spellEnd"/>
       <w:r>
         <w:t xml:space="preserve"> to create graphical remote process managers for help desk efficiency.</w:t>
       </w:r>
@@ -849,6 +1255,46 @@
     </w:p>
     <w:p>
       <w:pPr>
+        <w:pStyle w:val="ListBullet"/>
+        <w:numPr>
+          <w:ilvl w:val="0"/>
+          <w:numId w:val="0"/>
+        </w:numPr>
+        <w:ind w:left="360" w:hanging="360"/>
+      </w:pPr>
+    </w:p>
+    <w:p>
+      <w:pPr>
+        <w:pStyle w:val="ListBullet"/>
+        <w:numPr>
+          <w:ilvl w:val="0"/>
+          <w:numId w:val="0"/>
+        </w:numPr>
+        <w:ind w:left="360" w:hanging="360"/>
+      </w:pPr>
+    </w:p>
+    <w:p>
+      <w:pPr>
+        <w:pStyle w:val="ListBullet"/>
+        <w:numPr>
+          <w:ilvl w:val="0"/>
+          <w:numId w:val="0"/>
+        </w:numPr>
+        <w:ind w:left="360" w:hanging="360"/>
+      </w:pPr>
+    </w:p>
+    <w:p>
+      <w:pPr>
+        <w:pStyle w:val="ListBullet"/>
+        <w:numPr>
+          <w:ilvl w:val="0"/>
+          <w:numId w:val="0"/>
+        </w:numPr>
+        <w:ind w:left="360" w:hanging="360"/>
+      </w:pPr>
+    </w:p>
+    <w:p>
+      <w:pPr>
         <w:pStyle w:val="Heading3"/>
         <w:spacing w:before="480"/>
       </w:pPr>
@@ -860,6 +1306,7 @@
           <w:sz w:val="24"/>
           <w:szCs w:val="24"/>
         </w:rPr>
+        <w:lastRenderedPageBreak/>
         <w:t>IBM</w:t>
       </w:r>
       <w:r>
@@ -1001,7 +1448,10 @@
       </w:pPr>
       <w:bookmarkStart w:id="15" w:name="Project_1"/>
       <w:r>
-        <w:t>Generative AI Chatbot Integration | May 2026</w:t>
+        <w:t>Generative AI Chatbot Integration</w:t>
+      </w:r>
+      <w:r>
+        <w:t xml:space="preserve"> | May 2026</w:t>
       </w:r>
       <w:r>
         <w:t xml:space="preserve"> | </w:t>
@@ -1079,6 +1529,7 @@
         </w:rPr>
         <w:t xml:space="preserve">Engineered a modular provider system to toggle between a local </w:t>
       </w:r>
+      <w:proofErr w:type="spellStart"/>
       <w:r>
         <w:rPr>
           <w:b/>
@@ -1087,19 +1538,45 @@
         </w:rPr>
         <w:t>Ollama</w:t>
       </w:r>
+      <w:proofErr w:type="spellEnd"/>
       <w:r>
         <w:rPr>
           <w:lang w:val="en-CA"/>
         </w:rPr>
-        <w:t xml:space="preserve"> instance (Llama 3.2) for private development and </w:t>
-      </w:r>
+        <w:t xml:space="preserve"> instance (Llama 3.2</w:t>
+      </w:r>
+      <w:r>
+        <w:rPr>
+          <w:lang w:val="en-CA"/>
+        </w:rPr>
+        <w:t xml:space="preserve">, </w:t>
+      </w:r>
+      <w:r>
+        <w:t>OpenAI GPT-OSS 20B</w:t>
+      </w:r>
+      <w:r>
+        <w:rPr>
+          <w:lang w:val="en-CA"/>
+        </w:rPr>
+        <w:t xml:space="preserve">) for private development and </w:t>
+      </w:r>
+      <w:proofErr w:type="spellStart"/>
       <w:r>
         <w:rPr>
           <w:b/>
           <w:bCs/>
           <w:lang w:val="en-CA"/>
         </w:rPr>
-        <w:t>Groq’s LPU</w:t>
+        <w:t>Groq’s</w:t>
+      </w:r>
+      <w:proofErr w:type="spellEnd"/>
+      <w:r>
+        <w:rPr>
+          <w:b/>
+          <w:bCs/>
+          <w:lang w:val="en-CA"/>
+        </w:rPr>
+        <w:t xml:space="preserve"> LPU</w:t>
       </w:r>
       <w:r>
         <w:rPr>
@@ -1125,6 +1602,7 @@
         </w:rPr>
         <w:t>Implemented real-time streaming responses in C# Razor components using asynchronous iterators (</w:t>
       </w:r>
+      <w:proofErr w:type="spellStart"/>
       <w:r>
         <w:rPr>
           <w:b/>
@@ -1133,6 +1611,7 @@
         </w:rPr>
         <w:t>IAsyncEnumerable</w:t>
       </w:r>
+      <w:proofErr w:type="spellEnd"/>
       <w:r>
         <w:rPr>
           <w:lang w:val="en-CA"/>
@@ -1214,12 +1693,50 @@
     </w:p>
     <w:p>
       <w:pPr>
-        <w:pStyle w:val="Heading2"/>
-        <w:spacing w:before="480" w:after="120"/>
-      </w:pPr>
-      <w:r>
-        <w:lastRenderedPageBreak/>
-        <w:t>Education &amp; Training</w:t>
+        <w:pStyle w:val="ListBullet"/>
+        <w:numPr>
+          <w:ilvl w:val="0"/>
+          <w:numId w:val="0"/>
+        </w:numPr>
+        <w:ind w:left="7448" w:hanging="360"/>
+        <w:rPr>
+          <w:lang w:val="en-CA"/>
+        </w:rPr>
+      </w:pPr>
+    </w:p>
+    <w:p>
+      <w:pPr>
+        <w:pStyle w:val="Heading3"/>
+        <w:spacing w:before="0"/>
+        <w:ind w:left="227" w:hanging="227"/>
+      </w:pPr>
+      <w:bookmarkStart w:id="16" w:name="Project_2"/>
+      <w:r>
+        <w:t>Automotive Diagnostic Telemetry &amp; Power Management Hub (Versa</w:t>
+      </w:r>
+      <w:r>
+        <w:t xml:space="preserve"> </w:t>
+      </w:r>
+      <w:r>
+        <w:t>HUD)</w:t>
+      </w:r>
+      <w:r>
+        <w:t xml:space="preserve"> | </w:t>
+      </w:r>
+      <w:r>
+        <w:t>August-September</w:t>
+      </w:r>
+      <w:r>
+        <w:t xml:space="preserve"> 2026</w:t>
+      </w:r>
+      <w:r>
+        <w:t xml:space="preserve"> | https://github.com/dave-w-turner/</w:t>
+      </w:r>
+      <w:r>
+        <w:t>VersaHUD</w:t>
+      </w:r>
+      <w:r>
+        <w:t xml:space="preserve"> </w:t>
       </w:r>
     </w:p>
     <w:p>
@@ -1229,12 +1746,29 @@
           <w:tab w:val="clear" w:pos="7448"/>
         </w:tabs>
         <w:ind w:left="426"/>
-      </w:pPr>
-      <w:r>
-        <w:t xml:space="preserve">Durham College - </w:t>
-      </w:r>
-      <w:r>
-        <w:t xml:space="preserve">Web Design &amp; Computer Programming, </w:t>
+        <w:rPr>
+          <w:lang w:val="en-CA"/>
+        </w:rPr>
+      </w:pPr>
+      <w:r>
+        <w:rPr>
+          <w:lang w:val="en-CA"/>
+        </w:rPr>
+        <w:t xml:space="preserve">Built a Complete Automotive Tracking System: Developed a vehicle monitoring hub using an Arduino UNO R4 </w:t>
+      </w:r>
+      <w:proofErr w:type="spellStart"/>
+      <w:r>
+        <w:rPr>
+          <w:lang w:val="en-CA"/>
+        </w:rPr>
+        <w:t>WiFi</w:t>
+      </w:r>
+      <w:proofErr w:type="spellEnd"/>
+      <w:r>
+        <w:rPr>
+          <w:lang w:val="en-CA"/>
+        </w:rPr>
+        <w:t xml:space="preserve"> paired with a .NET MAUI Android dashboard application to track live voltages, run secure passcodes, and control hardware relays over the air.</w:t>
       </w:r>
     </w:p>
     <w:p>
@@ -1244,12 +1778,15 @@
           <w:tab w:val="clear" w:pos="7448"/>
         </w:tabs>
         <w:ind w:left="426"/>
-      </w:pPr>
-      <w:r>
-        <w:t xml:space="preserve">ProTech Training Services - </w:t>
-      </w:r>
-      <w:r>
-        <w:t>ALM &amp; Microsoft TFS</w:t>
+        <w:rPr>
+          <w:lang w:val="en-CA"/>
+        </w:rPr>
+      </w:pPr>
+      <w:r>
+        <w:rPr>
+          <w:lang w:val="en-CA"/>
+        </w:rPr>
+        <w:t>Designed smart battery cross charging rules: Programmed a solid value-driven state machine to safely bridge and isolate dual battery banks by using combined voltage limits to keep the isolation relay stable.</w:t>
       </w:r>
     </w:p>
     <w:p>
@@ -1259,16 +1796,199 @@
           <w:tab w:val="clear" w:pos="7448"/>
         </w:tabs>
         <w:ind w:left="426"/>
-      </w:pPr>
-      <w:r>
-        <w:t>Eastdale C.V.I. -</w:t>
-      </w:r>
-      <w:r>
-        <w:t xml:space="preserve"> Information Technology</w:t>
+        <w:rPr>
+          <w:lang w:val="en-CA"/>
+        </w:rPr>
+      </w:pPr>
+      <w:r>
+        <w:rPr>
+          <w:lang w:val="en-CA"/>
+        </w:rPr>
+        <w:t>Created a reliable wireless connection loop: Architected a thread-safe connection loop inside the app using a flat periodic background timer that handles reconnection checks cleanly without causing UI freezes or deadlocks in Release mode.</w:t>
+      </w:r>
+    </w:p>
+    <w:p>
+      <w:pPr>
+        <w:pStyle w:val="ListBullet"/>
+        <w:tabs>
+          <w:tab w:val="clear" w:pos="7448"/>
+        </w:tabs>
+        <w:ind w:left="426"/>
+        <w:rPr>
+          <w:lang w:val="en-CA"/>
+        </w:rPr>
+      </w:pPr>
+      <w:r>
+        <w:rPr>
+          <w:lang w:val="en-CA"/>
+        </w:rPr>
+        <w:t>Implemented automated wireless failovers: Configured multi-route networking logic that effortlessly switches lanes between Bluetooth LE, local Wi-Fi station routes, and standalone Access Point hotspot modes based on local subnet detection and live Cloudflare WAN route health checks.</w:t>
+      </w:r>
+    </w:p>
+    <w:p>
+      <w:pPr>
+        <w:pStyle w:val="ListBullet"/>
+        <w:tabs>
+          <w:tab w:val="clear" w:pos="7448"/>
+        </w:tabs>
+        <w:ind w:left="426"/>
+        <w:rPr>
+          <w:lang w:val="en-CA"/>
+        </w:rPr>
+      </w:pPr>
+      <w:r>
+        <w:rPr>
+          <w:lang w:val="en-CA"/>
+        </w:rPr>
+        <w:t>Secured wireless hardware commands: Integrated an embedded AES-128-CBC encryption cipher grid and Fletcher-16 cryptographic token verification to safely process encrypted over-the-air instructions.</w:t>
+      </w:r>
+    </w:p>
+    <w:p>
+      <w:pPr>
+        <w:pStyle w:val="ListBullet"/>
+        <w:tabs>
+          <w:tab w:val="clear" w:pos="7448"/>
+        </w:tabs>
+        <w:ind w:left="426"/>
+        <w:rPr>
+          <w:lang w:val="en-CA"/>
+        </w:rPr>
+      </w:pPr>
+      <w:r>
+        <w:rPr>
+          <w:lang w:val="en-CA"/>
+        </w:rPr>
+        <w:t>Engineered a RESTful cloud data pipeline: Structured dynamic JSON telemetry serialization models to offload historical data logs smoothly over lightweight HTTP POST requests to a custom Cloudflare Cloud Worker network.</w:t>
+      </w:r>
+    </w:p>
+    <w:p>
+      <w:pPr>
+        <w:pStyle w:val="ListBullet"/>
+        <w:tabs>
+          <w:tab w:val="clear" w:pos="7448"/>
+        </w:tabs>
+        <w:ind w:left="426"/>
+        <w:rPr>
+          <w:lang w:val="en-CA"/>
+        </w:rPr>
+      </w:pPr>
+      <w:r>
+        <w:rPr>
+          <w:lang w:val="en-CA"/>
+        </w:rPr>
+        <w:lastRenderedPageBreak/>
+        <w:t xml:space="preserve">Designed the interactive cockpit interface: Built a clean dark-mode dashboard UI featuring a responsive Bluetooth device picker page that safely handles Android runtime permissions alongside custom hardware switches for </w:t>
+      </w:r>
+      <w:r>
+        <w:rPr>
+          <w:lang w:val="en-CA"/>
+        </w:rPr>
+        <w:t xml:space="preserve">Auto </w:t>
+      </w:r>
+      <w:r>
+        <w:rPr>
+          <w:lang w:val="en-CA"/>
+        </w:rPr>
+        <w:t>S</w:t>
+      </w:r>
+      <w:r>
+        <w:rPr>
+          <w:lang w:val="en-CA"/>
+        </w:rPr>
+        <w:t>croll</w:t>
+      </w:r>
+      <w:r>
+        <w:rPr>
+          <w:lang w:val="en-CA"/>
+        </w:rPr>
+        <w:t>, Debug Logs, and Remote Telemetry.</w:t>
+      </w:r>
+      <w:bookmarkEnd w:id="16"/>
+    </w:p>
+    <w:p>
+      <w:pPr>
+        <w:pStyle w:val="ListBullet"/>
+        <w:numPr>
+          <w:ilvl w:val="0"/>
+          <w:numId w:val="0"/>
+        </w:numPr>
+        <w:ind w:left="426"/>
+        <w:rPr>
+          <w:lang w:val="en-CA"/>
+        </w:rPr>
+      </w:pPr>
+    </w:p>
+    <w:p>
+      <w:pPr>
+        <w:pStyle w:val="Heading2"/>
+        <w:spacing w:before="480" w:after="120"/>
+      </w:pPr>
+      <w:r>
+        <w:t>Education &amp; Training</w:t>
+      </w:r>
+    </w:p>
+    <w:p>
+      <w:pPr>
+        <w:pStyle w:val="ListBullet"/>
+        <w:tabs>
+          <w:tab w:val="clear" w:pos="7448"/>
+        </w:tabs>
+        <w:ind w:left="426"/>
+      </w:pPr>
+      <w:r>
+        <w:t xml:space="preserve">Durham College - </w:t>
+      </w:r>
+      <w:r>
+        <w:t xml:space="preserve">Web Design &amp; Computer Programming, </w:t>
+      </w:r>
+    </w:p>
+    <w:p>
+      <w:pPr>
+        <w:pStyle w:val="ListBullet"/>
+        <w:tabs>
+          <w:tab w:val="clear" w:pos="7448"/>
+        </w:tabs>
+        <w:ind w:left="426"/>
+      </w:pPr>
+      <w:proofErr w:type="spellStart"/>
+      <w:r>
+        <w:t>ProTech</w:t>
+      </w:r>
+      <w:proofErr w:type="spellEnd"/>
+      <w:r>
+        <w:t xml:space="preserve"> Training Services - </w:t>
+      </w:r>
+      <w:r>
+        <w:t>ALM &amp; Microsoft TFS</w:t>
+      </w:r>
+    </w:p>
+    <w:p>
+      <w:pPr>
+        <w:pStyle w:val="ListBullet"/>
+        <w:tabs>
+          <w:tab w:val="clear" w:pos="7448"/>
+        </w:tabs>
+        <w:ind w:left="426"/>
+      </w:pPr>
+      <w:proofErr w:type="spellStart"/>
+      <w:r>
+        <w:t>Eastdale</w:t>
+      </w:r>
+      <w:proofErr w:type="spellEnd"/>
+      <w:r>
+        <w:t xml:space="preserve"> C.V.I. -</w:t>
+      </w:r>
+      <w:r>
+        <w:t xml:space="preserve"> Information </w:t>
+      </w:r>
+      <w:proofErr w:type="gramStart"/>
+      <w:r>
+        <w:t>Technology</w:t>
       </w:r>
       <w:r>
         <w:t xml:space="preserve"> :</w:t>
       </w:r>
+      <w:proofErr w:type="gramEnd"/>
       <w:r>
         <w:t xml:space="preserve"> </w:t>
       </w:r>
@@ -1441,7 +2161,7 @@
   <w:abstractNum w:abstractNumId="8" w15:restartNumberingAfterBreak="0">
     <w:nsid w:val="FFFFFF89"/>
     <w:multiLevelType w:val="singleLevel"/>
-    <w:tmpl w:val="1FEE40D2"/>
+    <w:tmpl w:val="8DAEF4DC"/>
     <w:lvl w:ilvl="0">
       <w:start w:val="1"/>
       <w:numFmt w:val="bullet"/>
@@ -1642,6 +2362,9 @@
     <w:abstractNumId w:val="8"/>
   </w:num>
   <w:num w:numId="12" w16cid:durableId="342827694">
+    <w:abstractNumId w:val="8"/>
+  </w:num>
+  <w:num w:numId="13" w16cid:durableId="1264535014">
     <w:abstractNumId w:val="8"/>
   </w:num>
 </w:numbering>
@@ -2250,7 +2973,6 @@
   <w:style w:type="character" w:default="1" w:styleId="DefaultParagraphFont">
     <w:name w:val="Default Paragraph Font"/>
     <w:uiPriority w:val="1"/>
-    <w:semiHidden/>
     <w:unhideWhenUsed/>
   </w:style>
   <w:style w:type="table" w:default="1" w:styleId="TableNormal">
@@ -13060,6 +13782,16 @@
     <w:rPr>
       <w:color w:val="800080" w:themeColor="followedHyperlink"/>
       <w:u w:val="single"/>
+    </w:rPr>
+  </w:style>
+  <w:style w:type="character" w:styleId="PlaceholderText">
+    <w:name w:val="Placeholder Text"/>
+    <w:basedOn w:val="DefaultParagraphFont"/>
+    <w:uiPriority w:val="99"/>
+    <w:semiHidden/>
+    <w:rsid w:val="00390B58"/>
+    <w:rPr>
+      <w:color w:val="666666"/>
     </w:rPr>
   </w:style>
 </w:styles>

</xml_diff>

<commit_message>
Update resume. Need to switch file uploader to blob storage.
</commit_message>
<xml_diff>
--- a/CorporatePortfolio/wwwroot/DavidTurner_Resume.docx
+++ b/CorporatePortfolio/wwwroot/DavidTurner_Resume.docx
@@ -29,10 +29,13 @@
         <w:t xml:space="preserve">📞 </w:t>
       </w:r>
       <w:r>
-        <w:t>905-926-2398</w:t>
-      </w:r>
-      <w:r>
-        <w:t xml:space="preserve"> | ✉️ </w:t>
+        <w:t>905-</w:t>
+      </w:r>
+      <w:r>
+        <w:t xml:space="preserve">222-1148 </w:t>
+      </w:r>
+      <w:r>
+        <w:t xml:space="preserve">| ✉️ </w:t>
       </w:r>
       <w:hyperlink r:id="rId6" w:history="1">
         <w:r>
@@ -136,13 +139,8 @@
         <w:t xml:space="preserve">SQL, </w:t>
       </w:r>
       <w:r>
-        <w:t xml:space="preserve">TypeScript, ASP.NET Core, MVC, Entity Framework, Angular, </w:t>
-      </w:r>
-      <w:proofErr w:type="spellStart"/>
-      <w:r>
-        <w:t>SignalR</w:t>
-      </w:r>
-      <w:proofErr w:type="spellEnd"/>
+        <w:t>TypeScript, ASP.NET Core, MVC, Entity Framework, Angular, SignalR</w:t>
+      </w:r>
       <w:r>
         <w:t xml:space="preserve">, </w:t>
       </w:r>
@@ -290,15 +288,7 @@
         <w:t>Embedded &amp; Hardware Systems Controls</w:t>
       </w:r>
       <w:r>
-        <w:t xml:space="preserve">: Arduino R4 </w:t>
-      </w:r>
-      <w:proofErr w:type="spellStart"/>
-      <w:r>
-        <w:t>Wifi</w:t>
-      </w:r>
-      <w:proofErr w:type="spellEnd"/>
-      <w:r>
-        <w:t xml:space="preserve">, Analog-to-Digital Converters (CDC), EEPROM Persistent Storage, Real-Time Clocks (RTC), Relay Circuit Isolation, Power Inverter setup </w:t>
+        <w:t xml:space="preserve">: Arduino R4 Wifi, Analog-to-Digital Converters (CDC), EEPROM Persistent Storage, Real-Time Clocks (RTC), Relay Circuit Isolation, Power Inverter setup </w:t>
       </w:r>
     </w:p>
     <w:p>
@@ -342,23 +332,7 @@
         <w:t xml:space="preserve"> 2026</w:t>
       </w:r>
       <w:r>
-        <w:t xml:space="preserve">, Selenium, </w:t>
-      </w:r>
-      <w:proofErr w:type="spellStart"/>
-      <w:r>
-        <w:t>xUnit</w:t>
-      </w:r>
-      <w:proofErr w:type="spellEnd"/>
-      <w:r>
-        <w:t>/</w:t>
-      </w:r>
-      <w:proofErr w:type="spellStart"/>
-      <w:r>
-        <w:t>nUnit</w:t>
-      </w:r>
-      <w:proofErr w:type="spellEnd"/>
-      <w:r>
-        <w:t>, MS Test</w:t>
+        <w:t>, Selenium, xUnit/nUnit, MS Test</w:t>
       </w:r>
       <w:r>
         <w:t>, Cloudflare Workers</w:t>
@@ -444,15 +418,7 @@
         <w:t>Operating Systems</w:t>
       </w:r>
       <w:r>
-        <w:t xml:space="preserve">: Windows (All Versions), Linux (Ubuntu, Fedora, </w:t>
-      </w:r>
-      <w:proofErr w:type="spellStart"/>
-      <w:r>
-        <w:t>Redhat</w:t>
-      </w:r>
-      <w:proofErr w:type="spellEnd"/>
-      <w:r>
-        <w:t>, Kali)</w:t>
+        <w:t>: Windows (All Versions), Linux (Ubuntu, Fedora, Redhat, Kali)</w:t>
       </w:r>
     </w:p>
     <w:p>
@@ -491,35 +457,7 @@
         <w:rPr>
           <w:lang w:val="en-CA"/>
         </w:rPr>
-        <w:t xml:space="preserve">: </w:t>
-      </w:r>
-      <w:proofErr w:type="spellStart"/>
-      <w:r>
-        <w:rPr>
-          <w:lang w:val="en-CA"/>
-        </w:rPr>
-        <w:t>Ollama</w:t>
-      </w:r>
-      <w:proofErr w:type="spellEnd"/>
-      <w:r>
-        <w:rPr>
-          <w:lang w:val="en-CA"/>
-        </w:rPr>
-        <w:t xml:space="preserve">, </w:t>
-      </w:r>
-      <w:proofErr w:type="spellStart"/>
-      <w:r>
-        <w:rPr>
-          <w:lang w:val="en-CA"/>
-        </w:rPr>
-        <w:t>Groq</w:t>
-      </w:r>
-      <w:proofErr w:type="spellEnd"/>
-      <w:r>
-        <w:rPr>
-          <w:lang w:val="en-CA"/>
-        </w:rPr>
-        <w:t>, Llama3.2 LLM,</w:t>
+        <w:t>: Ollama, Groq, Llama3.2 LLM,</w:t>
       </w:r>
       <w:r>
         <w:rPr>
@@ -1213,19 +1151,9 @@
       <w:r>
         <w:t xml:space="preserve">Reverse engineered </w:t>
       </w:r>
-      <w:proofErr w:type="spellStart"/>
-      <w:r>
-        <w:t>PsTools</w:t>
-      </w:r>
-      <w:proofErr w:type="spellEnd"/>
-      <w:r>
-        <w:t xml:space="preserve"> by </w:t>
-      </w:r>
-      <w:proofErr w:type="spellStart"/>
-      <w:r>
-        <w:t>Sysinternals</w:t>
-      </w:r>
-      <w:proofErr w:type="spellEnd"/>
+      <w:r>
+        <w:t>PsTools by Sysinternals</w:t>
+      </w:r>
       <w:r>
         <w:t xml:space="preserve"> to create graphical remote process managers for help desk efficiency.</w:t>
       </w:r>
@@ -1529,7 +1457,6 @@
         </w:rPr>
         <w:t xml:space="preserve">Engineered a modular provider system to toggle between a local </w:t>
       </w:r>
-      <w:proofErr w:type="spellStart"/>
       <w:r>
         <w:rPr>
           <w:b/>
@@ -1538,7 +1465,6 @@
         </w:rPr>
         <w:t>Ollama</w:t>
       </w:r>
-      <w:proofErr w:type="spellEnd"/>
       <w:r>
         <w:rPr>
           <w:lang w:val="en-CA"/>
@@ -1560,23 +1486,13 @@
         </w:rPr>
         <w:t xml:space="preserve">) for private development and </w:t>
       </w:r>
-      <w:proofErr w:type="spellStart"/>
       <w:r>
         <w:rPr>
           <w:b/>
           <w:bCs/>
           <w:lang w:val="en-CA"/>
         </w:rPr>
-        <w:t>Groq’s</w:t>
-      </w:r>
-      <w:proofErr w:type="spellEnd"/>
-      <w:r>
-        <w:rPr>
-          <w:b/>
-          <w:bCs/>
-          <w:lang w:val="en-CA"/>
-        </w:rPr>
-        <w:t xml:space="preserve"> LPU</w:t>
+        <w:t>Groq’s LPU</w:t>
       </w:r>
       <w:r>
         <w:rPr>
@@ -1602,7 +1518,6 @@
         </w:rPr>
         <w:t>Implemented real-time streaming responses in C# Razor components using asynchronous iterators (</w:t>
       </w:r>
-      <w:proofErr w:type="spellStart"/>
       <w:r>
         <w:rPr>
           <w:b/>
@@ -1611,7 +1526,6 @@
         </w:rPr>
         <w:t>IAsyncEnumerable</w:t>
       </w:r>
-      <w:proofErr w:type="spellEnd"/>
       <w:r>
         <w:rPr>
           <w:lang w:val="en-CA"/>
@@ -1730,10 +1644,7 @@
         <w:t xml:space="preserve"> 2026</w:t>
       </w:r>
       <w:r>
-        <w:t xml:space="preserve"> | https://github.com/dave-w-turner/</w:t>
-      </w:r>
-      <w:r>
-        <w:t>VersaHUD</w:t>
+        <w:t xml:space="preserve"> | https://github.com/dave-w-turner/VersaHUD</w:t>
       </w:r>
       <w:r>
         <w:t xml:space="preserve"> </w:t>
@@ -1754,21 +1665,7 @@
         <w:rPr>
           <w:lang w:val="en-CA"/>
         </w:rPr>
-        <w:t xml:space="preserve">Built a Complete Automotive Tracking System: Developed a vehicle monitoring hub using an Arduino UNO R4 </w:t>
-      </w:r>
-      <w:proofErr w:type="spellStart"/>
-      <w:r>
-        <w:rPr>
-          <w:lang w:val="en-CA"/>
-        </w:rPr>
-        <w:t>WiFi</w:t>
-      </w:r>
-      <w:proofErr w:type="spellEnd"/>
-      <w:r>
-        <w:rPr>
-          <w:lang w:val="en-CA"/>
-        </w:rPr>
-        <w:t xml:space="preserve"> paired with a .NET MAUI Android dashboard application to track live voltages, run secure passcodes, and control hardware relays over the air.</w:t>
+        <w:t>Built a Complete Automotive Tracking System: Developed a vehicle monitoring hub using an Arduino UNO R4 WiFi paired with a .NET MAUI Android dashboard application to track live voltages, run secure passcodes, and control hardware relays over the air.</w:t>
       </w:r>
     </w:p>
     <w:p>
@@ -1950,13 +1847,8 @@
         </w:tabs>
         <w:ind w:left="426"/>
       </w:pPr>
-      <w:proofErr w:type="spellStart"/>
-      <w:r>
-        <w:t>ProTech</w:t>
-      </w:r>
-      <w:proofErr w:type="spellEnd"/>
-      <w:r>
-        <w:t xml:space="preserve"> Training Services - </w:t>
+      <w:r>
+        <w:t xml:space="preserve">ProTech Training Services - </w:t>
       </w:r>
       <w:r>
         <w:t>ALM &amp; Microsoft TFS</w:t>
@@ -1970,25 +1862,15 @@
         </w:tabs>
         <w:ind w:left="426"/>
       </w:pPr>
-      <w:proofErr w:type="spellStart"/>
-      <w:r>
-        <w:t>Eastdale</w:t>
-      </w:r>
-      <w:proofErr w:type="spellEnd"/>
-      <w:r>
-        <w:t xml:space="preserve"> C.V.I. -</w:t>
-      </w:r>
-      <w:r>
-        <w:t xml:space="preserve"> Information </w:t>
-      </w:r>
-      <w:proofErr w:type="gramStart"/>
-      <w:r>
-        <w:t>Technology</w:t>
+      <w:r>
+        <w:t>Eastdale C.V.I. -</w:t>
+      </w:r>
+      <w:r>
+        <w:t xml:space="preserve"> Information Technology</w:t>
       </w:r>
       <w:r>
         <w:t xml:space="preserve"> :</w:t>
       </w:r>
-      <w:proofErr w:type="gramEnd"/>
       <w:r>
         <w:t xml:space="preserve"> </w:t>
       </w:r>
@@ -2973,6 +2855,7 @@
   <w:style w:type="character" w:default="1" w:styleId="DefaultParagraphFont">
     <w:name w:val="Default Paragraph Font"/>
     <w:uiPriority w:val="1"/>
+    <w:semiHidden/>
     <w:unhideWhenUsed/>
   </w:style>
   <w:style w:type="table" w:default="1" w:styleId="TableNormal">

</xml_diff>